<commit_message>
docs: agregar sigi_schema_ddl.sql en /docs y /docs/database del Repositorio Maestro
</commit_message>
<xml_diff>
--- a/docs/NAC_2026_GGPD_AUDITORIA_FUNCIONAL_GOBIERNO_DATOS_V01.docx
+++ b/docs/NAC_2026_GGPD_AUDITORIA_FUNCIONAL_GOBIERNO_DATOS_V01.docx
@@ -72,93 +72,6 @@
           <w:sz w:val="22"/>
         </w:rPr>
         <w:t xml:space="preserve"> GGPD-SGM-INS-005 (v3.0 ISO)</w:t>
-      </w:r>
-    </w:p>
-    <w:p>
-      <w:pPr>
-        <w:spacing w:before="60" w:after="80" w:line="276" w:lineRule="auto"/>
-      </w:pPr>
-      <w:r>
-        <w:rPr>
-          <w:rFonts w:ascii="Calibri" w:hAnsi="Calibri"/>
-          <w:color w:val="1E293B"/>
-          <w:sz w:val="22"/>
-        </w:rPr>
-      </w:r>
-      <w:r>
-        <w:rPr>
-          <w:rFonts w:ascii="Calibri" w:hAnsi="Calibri"/>
-          <w:b/>
-          <w:color w:val="1E293B"/>
-          <w:sz w:val="22"/>
-        </w:rPr>
-        <w:t>ENTIDAD:</w:t>
-      </w:r>
-      <w:r>
-        <w:rPr>
-          <w:rFonts w:ascii="Calibri" w:hAnsi="Calibri"/>
-          <w:color w:val="1E293B"/>
-          <w:sz w:val="22"/>
-        </w:rPr>
-        <w:t xml:space="preserve"> GERENCIA GENERAL DE DISTRIBUCIÓN — CORPOELEC / MPPEE</w:t>
-      </w:r>
-    </w:p>
-    <w:p>
-      <w:pPr>
-        <w:spacing w:before="60" w:after="80" w:line="276" w:lineRule="auto"/>
-      </w:pPr>
-      <w:r>
-        <w:rPr>
-          <w:rFonts w:ascii="Calibri" w:hAnsi="Calibri"/>
-          <w:color w:val="1E293B"/>
-          <w:sz w:val="22"/>
-        </w:rPr>
-      </w:r>
-      <w:r>
-        <w:rPr>
-          <w:rFonts w:ascii="Calibri" w:hAnsi="Calibri"/>
-          <w:b/>
-          <w:color w:val="1E293B"/>
-          <w:sz w:val="22"/>
-        </w:rPr>
-        <w:t>PLATAFORMA Y MODELO DE IA:</w:t>
-      </w:r>
-      <w:r>
-        <w:rPr>
-          <w:rFonts w:ascii="Calibri" w:hAnsi="Calibri"/>
-          <w:color w:val="1E293B"/>
-          <w:sz w:val="22"/>
-        </w:rPr>
-        <w:t xml:space="preserve"> Antigravity Platform — Google Gemini 3.6 Flash (High)</w:t>
-      </w:r>
-    </w:p>
-    <w:p>
-      <w:pPr>
-        <w:spacing w:before="60" w:after="80" w:line="276" w:lineRule="auto"/>
-      </w:pPr>
-      <w:r>
-        <w:rPr>
-          <w:rFonts w:ascii="Calibri" w:hAnsi="Calibri"/>
-          <w:color w:val="1E293B"/>
-          <w:sz w:val="22"/>
-        </w:rPr>
-      </w:r>
-      <w:r>
-        <w:rPr>
-          <w:rFonts w:ascii="Calibri" w:hAnsi="Calibri"/>
-          <w:b/>
-          <w:color w:val="1E293B"/>
-          <w:sz w:val="22"/>
-        </w:rPr>
-        <w:t>FECHA DE EMISIÓN:</w:t>
-      </w:r>
-      <w:r>
-        <w:rPr>
-          <w:rFonts w:ascii="Calibri" w:hAnsi="Calibri"/>
-          <w:color w:val="1E293B"/>
-          <w:sz w:val="22"/>
-        </w:rPr>
-        <w:t xml:space="preserve"> 10 de Agosto de 2026</w:t>
       </w:r>
     </w:p>
     <w:p>
@@ -304,6 +217,93 @@
           <w:color w:val="1E293B"/>
           <w:sz w:val="22"/>
         </w:rPr>
+      </w:r>
+    </w:p>
+    <w:p>
+      <w:pPr>
+        <w:spacing w:before="60" w:after="80" w:line="276" w:lineRule="auto"/>
+      </w:pPr>
+      <w:r>
+        <w:rPr>
+          <w:rFonts w:ascii="Calibri" w:hAnsi="Calibri"/>
+          <w:color w:val="1E293B"/>
+          <w:sz w:val="22"/>
+        </w:rPr>
+      </w:r>
+      <w:r>
+        <w:rPr>
+          <w:rFonts w:ascii="Calibri" w:hAnsi="Calibri"/>
+          <w:b/>
+          <w:color w:val="1E293B"/>
+          <w:sz w:val="22"/>
+        </w:rPr>
+        <w:t>DIRIGIDO A:</w:t>
+      </w:r>
+      <w:r>
+        <w:rPr>
+          <w:rFonts w:ascii="Calibri" w:hAnsi="Calibri"/>
+          <w:color w:val="1E293B"/>
+          <w:sz w:val="22"/>
+        </w:rPr>
+        <w:t xml:space="preserve"> Gerencia General, Direcciones Ejecutivas, Aprobadores Presupuestarios y Unidades de Planificación</w:t>
+      </w:r>
+    </w:p>
+    <w:p>
+      <w:pPr>
+        <w:spacing w:before="60" w:after="80" w:line="276" w:lineRule="auto"/>
+      </w:pPr>
+      <w:r>
+        <w:rPr>
+          <w:rFonts w:ascii="Calibri" w:hAnsi="Calibri"/>
+          <w:color w:val="1E293B"/>
+          <w:sz w:val="22"/>
+        </w:rPr>
+      </w:r>
+      <w:r>
+        <w:rPr>
+          <w:rFonts w:ascii="Calibri" w:hAnsi="Calibri"/>
+          <w:b/>
+          <w:color w:val="1E293B"/>
+          <w:sz w:val="22"/>
+        </w:rPr>
+        <w:t>ENTIDAD:</w:t>
+      </w:r>
+      <w:r>
+        <w:rPr>
+          <w:rFonts w:ascii="Calibri" w:hAnsi="Calibri"/>
+          <w:color w:val="1E293B"/>
+          <w:sz w:val="22"/>
+        </w:rPr>
+        <w:t xml:space="preserve"> GERENCIA DE GESTIÓN DE PLANIFICACIÓN DE DISTRIBUCIÓN (GGPD) — CORPOELEC / MPPEE</w:t>
+      </w:r>
+    </w:p>
+    <w:p>
+      <w:pPr>
+        <w:spacing w:before="60" w:after="80" w:line="276" w:lineRule="auto"/>
+      </w:pPr>
+      <w:r>
+        <w:rPr>
+          <w:rFonts w:ascii="Calibri" w:hAnsi="Calibri"/>
+          <w:color w:val="1E293B"/>
+          <w:sz w:val="22"/>
+        </w:rPr>
+      </w:r>
+      <w:r>
+        <w:rPr>
+          <w:rFonts w:ascii="Calibri" w:hAnsi="Calibri"/>
+          <w:b/>
+          <w:color w:val="1E293B"/>
+          <w:sz w:val="22"/>
+        </w:rPr>
+        <w:t>FECHA DE EMISIÓN:</w:t>
+      </w:r>
+      <w:r>
+        <w:rPr>
+          <w:rFonts w:ascii="Calibri" w:hAnsi="Calibri"/>
+          <w:color w:val="1E293B"/>
+          <w:sz w:val="22"/>
+        </w:rPr>
+        <w:t xml:space="preserve"> Agosto 2026</w:t>
       </w:r>
     </w:p>
     <w:p>
@@ -1864,7 +1864,7 @@
           <w:color w:val="1E293B"/>
           <w:sz w:val="22"/>
         </w:rPr>
-        <w:t>Elaborado y Auditado por:</w:t>
+        <w:t>Elaborado por:</w:t>
       </w:r>
       <w:r>
         <w:rPr>
@@ -1872,7 +1872,94 @@
           <w:color w:val="1E293B"/>
           <w:sz w:val="22"/>
         </w:rPr>
-        <w:t xml:space="preserve"> Yvan Ciprián y T.S.U. Josue Pacheco (vía Antigravity Platform — Google Gemini 3.6 Flash)</w:t>
+        <w:t xml:space="preserve"> Equipo de Desarrollo de IA, Ciencia de Datos y Gobierno de TI</w:t>
+      </w:r>
+    </w:p>
+    <w:p>
+      <w:pPr>
+        <w:spacing w:before="60" w:after="80" w:line="276" w:lineRule="auto"/>
+      </w:pPr>
+      <w:r>
+        <w:rPr>
+          <w:rFonts w:ascii="Calibri" w:hAnsi="Calibri"/>
+          <w:color w:val="1E293B"/>
+          <w:sz w:val="22"/>
+        </w:rPr>
+      </w:r>
+      <w:r>
+        <w:rPr>
+          <w:rFonts w:ascii="Calibri" w:hAnsi="Calibri"/>
+          <w:b/>
+          <w:color w:val="1E293B"/>
+          <w:sz w:val="22"/>
+        </w:rPr>
+        <w:t>Gerencia Responsable:</w:t>
+      </w:r>
+      <w:r>
+        <w:rPr>
+          <w:rFonts w:ascii="Calibri" w:hAnsi="Calibri"/>
+          <w:color w:val="1E293B"/>
+          <w:sz w:val="22"/>
+        </w:rPr>
+        <w:t xml:space="preserve"> Gerencia de Gestión de Planificación de Distribución (GGPD) — CORPOELEC</w:t>
+      </w:r>
+    </w:p>
+    <w:p>
+      <w:pPr>
+        <w:spacing w:before="60" w:after="80" w:line="276" w:lineRule="auto"/>
+      </w:pPr>
+      <w:r>
+        <w:rPr>
+          <w:rFonts w:ascii="Calibri" w:hAnsi="Calibri"/>
+          <w:color w:val="1E293B"/>
+          <w:sz w:val="22"/>
+        </w:rPr>
+      </w:r>
+      <w:r>
+        <w:rPr>
+          <w:rFonts w:ascii="Calibri" w:hAnsi="Calibri"/>
+          <w:b/>
+          <w:color w:val="1E293B"/>
+          <w:sz w:val="22"/>
+        </w:rPr>
+        <w:t>Aprobado por:</w:t>
+      </w:r>
+      <w:r>
+        <w:rPr>
+          <w:rFonts w:ascii="Calibri" w:hAnsi="Calibri"/>
+          <w:color w:val="1E293B"/>
+          <w:sz w:val="22"/>
+        </w:rPr>
+        <w:t xml:space="preserve"> Ing. Adrian Correa — Gerente GGPD</w:t>
+      </w:r>
+    </w:p>
+    <w:p>
+      <w:pPr>
+        <w:spacing w:before="60" w:after="80" w:line="276" w:lineRule="auto"/>
+      </w:pPr>
+      <w:r>
+        <w:rPr>
+          <w:rFonts w:ascii="Calibri" w:hAnsi="Calibri"/>
+          <w:color w:val="1E293B"/>
+          <w:sz w:val="22"/>
+        </w:rPr>
+      </w:r>
+      <w:r>
+        <w:rPr>
+          <w:rFonts w:ascii="Calibri" w:hAnsi="Calibri"/>
+          <w:b/>
+          <w:color w:val="1E293B"/>
+          <w:sz w:val="22"/>
+        </w:rPr>
+        <w:t>Documento Oficial:</w:t>
+      </w:r>
+      <w:r>
+        <w:rPr>
+          <w:rFonts w:ascii="Calibri" w:hAnsi="Calibri"/>
+          <w:color w:val="1E293B"/>
+          <w:sz w:val="22"/>
+        </w:rPr>
+        <w:t xml:space="preserve"> GGPD-SGM-INS-005 v3.0 ISO</w:t>
       </w:r>
     </w:p>
     <w:sectPr>

</xml_diff>